<commit_message>
Remove tagline under name; sync Word and site
Co-Authored-By: Claude Opus 4.8 <noreply@anthropic.com>
</commit_message>
<xml_diff>
--- a/assets/Uday_Barooah_Business_Resume.docx
+++ b/assets/Uday_Barooah_Business_Resume.docx
@@ -20,22 +20,6 @@
     </w:p>
     <w:p>
       <w:pPr>
-        <w:spacing w:after="60"/>
-      </w:pPr>
-      <w:r>
-        <w:rPr>
-          <w:b/>
-          <w:bCs/>
-          <w:color w:val="13524B"/>
-          <w:spacing w:val="20"/>
-          <w:sz w:val="19"/>
-          <w:szCs w:val="19"/>
-        </w:rPr>
-        <w:t xml:space="preserve">FOUNDER, OPERATOR AND PRODUCT BUILDER</w:t>
-      </w:r>
-    </w:p>
-    <w:p>
-      <w:pPr>
         <w:spacing w:after="120"/>
       </w:pPr>
       <w:r>
@@ -54,7 +38,7 @@
         </w:rPr>
         <w:t xml:space="preserve">   |   </w:t>
       </w:r>
-      <w:hyperlink w:history="1" r:id="rIdypynzoliwf_lntijq0eq7">
+      <w:hyperlink w:history="1" r:id="rId6s4kfidrqdhy7sruv5hj2">
         <w:r>
           <w:rPr>
             <w:color w:val="13524B"/>
@@ -88,7 +72,7 @@
         </w:rPr>
         <w:t xml:space="preserve">   |   </w:t>
       </w:r>
-      <w:hyperlink w:history="1" r:id="rIde_i5hote3gygkps68x6dg">
+      <w:hyperlink w:history="1" r:id="rIdp0m-klllwa3wc-tkadgc0">
         <w:r>
           <w:rPr>
             <w:color w:val="13524B"/>
@@ -1173,7 +1157,7 @@
         </w:rPr>
         <w:t xml:space="preserve">Marketing Visibility Audit (SEO + Meta Ads), AIM Live Ops platform, retail deck generator, and deidentified sport-monitoring dashboards. Full portfolio of agentic workflows and dashboards: </w:t>
       </w:r>
-      <w:hyperlink w:history="1" r:id="rIdphukjrfmihokyhhg1kzwh">
+      <w:hyperlink w:history="1" r:id="rIdmg39prt7jtsu--pqpdexb">
         <w:r>
           <w:rPr>
             <w:color w:val="13524B"/>

</xml_diff>

<commit_message>
Resume: BI tools, GymAware/VBT, speed prescription, Product&UX, AUSA product+leadgen. Portfolio: footer contact, deck loop, lighter report numbers
Co-Authored-By: Claude Opus 4.8 <noreply@anthropic.com>
</commit_message>
<xml_diff>
--- a/assets/Uday_Barooah_Business_Resume.docx
+++ b/assets/Uday_Barooah_Business_Resume.docx
@@ -38,7 +38,7 @@
         </w:rPr>
         <w:t xml:space="preserve">   |   </w:t>
       </w:r>
-      <w:hyperlink w:history="1" r:id="rId6s4kfidrqdhy7sruv5hj2">
+      <w:hyperlink w:history="1" r:id="rIduqxnkl4i3otn6-wpokimk">
         <w:r>
           <w:rPr>
             <w:color w:val="13524B"/>
@@ -72,7 +72,7 @@
         </w:rPr>
         <w:t xml:space="preserve">   |   </w:t>
       </w:r>
-      <w:hyperlink w:history="1" r:id="rIdp0m-klllwa3wc-tkadgc0">
+      <w:hyperlink w:history="1" r:id="rIdzr7gmqa3onmik9kayg2k7">
         <w:r>
           <w:rPr>
             <w:color w:val="13524B"/>
@@ -647,6 +647,23 @@
           <w:sz w:val="21"/>
           <w:szCs w:val="21"/>
         </w:rPr>
+        <w:t xml:space="preserve">Designed the program product and the lead-generation funnels that brought athletes in, owning the customer experience from first touch through to enrolment.</w:t>
+      </w:r>
+    </w:p>
+    <w:p>
+      <w:pPr>
+        <w:pStyle w:val="ListParagraph"/>
+        <w:numPr>
+          <w:ilvl w:val="0"/>
+          <w:numId w:val="2"/>
+        </w:numPr>
+        <w:spacing w:after="30"/>
+      </w:pPr>
+      <w:r>
+        <w:rPr>
+          <w:sz w:val="21"/>
+          <w:szCs w:val="21"/>
+        </w:rPr>
         <w:t xml:space="preserve">Led the expansion from a single site: scouted locations, negotiated leases, and sourced manufacturers and contractors for fitouts and development-application filing.</w:t>
       </w:r>
     </w:p>
@@ -1157,7 +1174,7 @@
         </w:rPr>
         <w:t xml:space="preserve">Marketing Visibility Audit (SEO + Meta Ads), AIM Live Ops platform, retail deck generator, and deidentified sport-monitoring dashboards. Full portfolio of agentic workflows and dashboards: </w:t>
       </w:r>
-      <w:hyperlink w:history="1" r:id="rIdmg39prt7jtsu--pqpdexb">
+      <w:hyperlink w:history="1" r:id="rIdyq1n5q8gn_7uchgnbjza8">
         <w:r>
           <w:rPr>
             <w:color w:val="13524B"/>
@@ -1185,6 +1202,29 @@
           <w:szCs w:val="22"/>
         </w:rPr>
         <w:t xml:space="preserve">SKILLS</w:t>
+      </w:r>
+    </w:p>
+    <w:p>
+      <w:pPr>
+        <w:spacing w:after="40"/>
+      </w:pPr>
+      <w:r>
+        <w:rPr>
+          <w:b/>
+          <w:bCs/>
+          <w:color w:val="1A1A1A"/>
+          <w:sz w:val="20"/>
+          <w:szCs w:val="20"/>
+        </w:rPr>
+        <w:t xml:space="preserve">Product &amp; UX:  </w:t>
+      </w:r>
+      <w:r>
+        <w:rPr>
+          <w:color w:val="1A1A1A"/>
+          <w:sz w:val="20"/>
+          <w:szCs w:val="20"/>
+        </w:rPr>
+        <w:t xml:space="preserve">Jobs-to-Be-Done discovery, product and UX design, lead-generation funnels, end-to-end delivery and adoption</w:t>
       </w:r>
     </w:p>
     <w:p>

</xml_diff>